<commit_message>
Add new images and update existing document file
</commit_message>
<xml_diff>
--- a/описание.docx
+++ b/описание.docx
@@ -893,12 +893,6 @@
         <w:gridCol w:w="6418"/>
       </w:tblGrid>
       <w:tr>
-        <w:tblPrEx>
-          <w:tblCellMar>
-            <w:top w:w="0" w:type="dxa"/>
-            <w:bottom w:w="0" w:type="dxa"/>
-          </w:tblCellMar>
-        </w:tblPrEx>
         <w:trPr>
           <w:tblHeader/>
         </w:trPr>
@@ -970,12 +964,6 @@
         </w:tc>
       </w:tr>
       <w:tr>
-        <w:tblPrEx>
-          <w:tblCellMar>
-            <w:top w:w="0" w:type="dxa"/>
-            <w:bottom w:w="0" w:type="dxa"/>
-          </w:tblCellMar>
-        </w:tblPrEx>
         <w:tc>
           <w:tcPr>
             <w:tcW w:w="2700" w:type="dxa"/>
@@ -1170,12 +1158,6 @@
         </w:tc>
       </w:tr>
       <w:tr>
-        <w:tblPrEx>
-          <w:tblCellMar>
-            <w:top w:w="0" w:type="dxa"/>
-            <w:bottom w:w="0" w:type="dxa"/>
-          </w:tblCellMar>
-        </w:tblPrEx>
         <w:tc>
           <w:tcPr>
             <w:tcW w:w="2700" w:type="dxa"/>
@@ -1398,12 +1380,6 @@
         </w:tc>
       </w:tr>
       <w:tr>
-        <w:tblPrEx>
-          <w:tblCellMar>
-            <w:top w:w="0" w:type="dxa"/>
-            <w:bottom w:w="0" w:type="dxa"/>
-          </w:tblCellMar>
-        </w:tblPrEx>
         <w:tc>
           <w:tcPr>
             <w:tcW w:w="2700" w:type="dxa"/>
@@ -1554,12 +1530,6 @@
         </w:tc>
       </w:tr>
       <w:tr>
-        <w:tblPrEx>
-          <w:tblCellMar>
-            <w:top w:w="0" w:type="dxa"/>
-            <w:bottom w:w="0" w:type="dxa"/>
-          </w:tblCellMar>
-        </w:tblPrEx>
         <w:tc>
           <w:tcPr>
             <w:tcW w:w="2700" w:type="dxa"/>
@@ -1843,12 +1813,6 @@
         </w:tc>
       </w:tr>
       <w:tr>
-        <w:tblPrEx>
-          <w:tblCellMar>
-            <w:top w:w="0" w:type="dxa"/>
-            <w:bottom w:w="0" w:type="dxa"/>
-          </w:tblCellMar>
-        </w:tblPrEx>
         <w:tc>
           <w:tcPr>
             <w:tcW w:w="2700" w:type="dxa"/>
@@ -4499,14 +4463,14 @@
         <w:rPr>
           <w:lang w:val="bg-BG"/>
         </w:rPr>
-        <w:t>Click-ове с</w:t>
-      </w:r>
-      <w:proofErr w:type="spellEnd"/>
-      <w:r>
-        <w:rPr>
-          <w:lang w:val="bg-BG"/>
-        </w:rPr>
-        <w:t xml:space="preserve"> мишката заместват </w:t>
+        <w:t>Click-ове</w:t>
+      </w:r>
+      <w:proofErr w:type="spellEnd"/>
+      <w:r>
+        <w:rPr>
+          <w:lang w:val="bg-BG"/>
+        </w:rPr>
+        <w:t xml:space="preserve"> с мишката заместват </w:t>
       </w:r>
       <w:proofErr w:type="spellStart"/>
       <w:r>
@@ -4806,7 +4770,16 @@
         <w:rPr>
           <w:lang w:val="bg-BG"/>
         </w:rPr>
-        <w:t>📷 Снимки от работата на приложението — прикачени отделно</w:t>
+        <w:t xml:space="preserve">📷 Снимки от работата на приложението — прикачени </w:t>
+      </w:r>
+      <w:r>
+        <w:rPr>
+          <w:lang w:val="bg-BG"/>
+        </w:rPr>
+        <w:t xml:space="preserve">в папка </w:t>
+      </w:r>
+      <w:r>
+        <w:t>“pictures”</w:t>
       </w:r>
     </w:p>
     <w:p>
@@ -4825,15 +4798,35 @@
         <w:rPr>
           <w:lang w:val="bg-BG"/>
         </w:rPr>
-        <w:t>🎥 Видео демонстрация — прикачено отделно</w:t>
-      </w:r>
+        <w:t xml:space="preserve">🎥 Видео демонстрация — </w:t>
+      </w:r>
+      <w:hyperlink r:id="rId5" w:history="1">
+        <w:r>
+          <w:rPr>
+            <w:rStyle w:val="Hyperlink"/>
+            <w:lang w:val="bg-BG"/>
+          </w:rPr>
+          <w:t>https://youtube.com/shorts/UnwkxoHBp</w:t>
+        </w:r>
+        <w:r>
+          <w:rPr>
+            <w:rStyle w:val="Hyperlink"/>
+            <w:lang w:val="bg-BG"/>
+          </w:rPr>
+          <w:t>9</w:t>
+        </w:r>
+        <w:r>
+          <w:rPr>
+            <w:rStyle w:val="Hyperlink"/>
+            <w:lang w:val="bg-BG"/>
+          </w:rPr>
+          <w:t>g</w:t>
+        </w:r>
+      </w:hyperlink>
     </w:p>
     <w:p>
       <w:pPr>
         <w:spacing w:before="120" w:after="80"/>
-        <w:rPr>
-          <w:lang w:val="bg-BG"/>
-        </w:rPr>
       </w:pPr>
       <w:proofErr w:type="spellStart"/>
       <w:r>
@@ -4907,7 +4900,7 @@
         </w:rPr>
         <w:t xml:space="preserve">): </w:t>
       </w:r>
-      <w:hyperlink r:id="rId5" w:history="1">
+      <w:hyperlink r:id="rId6" w:history="1">
         <w:r>
           <w:rPr>
             <w:rStyle w:val="Hyperlink"/>
@@ -4915,25 +4908,7 @@
             <w:bCs/>
             <w:lang w:val="bg-BG"/>
           </w:rPr>
-          <w:t>https://github.com/hugo</w:t>
-        </w:r>
-        <w:r>
-          <w:rPr>
-            <w:rStyle w:val="Hyperlink"/>
-            <w:b/>
-            <w:bCs/>
-            <w:lang w:val="bg-BG"/>
-          </w:rPr>
-          <w:t>v</w:t>
-        </w:r>
-        <w:r>
-          <w:rPr>
-            <w:rStyle w:val="Hyperlink"/>
-            <w:b/>
-            <w:bCs/>
-            <w:lang w:val="bg-BG"/>
-          </w:rPr>
-          <w:t>asko/3dtvr</w:t>
+          <w:t>https://github.com/hugovasko/3dtvr</w:t>
         </w:r>
       </w:hyperlink>
     </w:p>
@@ -4943,128 +4918,6 @@
           <w:lang w:val="bg-BG"/>
         </w:rPr>
       </w:pPr>
-      <w:proofErr w:type="spellStart"/>
-      <w:r>
-        <w:rPr>
-          <w:b/>
-          <w:bCs/>
-          <w:lang w:val="bg-BG"/>
-        </w:rPr>
-        <w:t>Submission</w:t>
-      </w:r>
-      <w:proofErr w:type="spellEnd"/>
-      <w:r>
-        <w:rPr>
-          <w:b/>
-          <w:bCs/>
-          <w:lang w:val="bg-BG"/>
-        </w:rPr>
-        <w:t xml:space="preserve"> </w:t>
-      </w:r>
-      <w:proofErr w:type="spellStart"/>
-      <w:r>
-        <w:rPr>
-          <w:b/>
-          <w:bCs/>
-          <w:lang w:val="bg-BG"/>
-        </w:rPr>
-        <w:t>archive</w:t>
-      </w:r>
-      <w:proofErr w:type="spellEnd"/>
-      <w:r>
-        <w:rPr>
-          <w:b/>
-          <w:bCs/>
-          <w:lang w:val="bg-BG"/>
-        </w:rPr>
-        <w:t xml:space="preserve">: </w:t>
-      </w:r>
-      <w:r>
-        <w:rPr>
-          <w:rFonts w:ascii="Consolas" w:eastAsia="Consolas" w:hAnsi="Consolas" w:cs="Consolas"/>
-          <w:shd w:val="clear" w:color="auto" w:fill="EFEFEF"/>
-          <w:lang w:val="bg-BG"/>
-        </w:rPr>
-        <w:t>ARPCDisassembly_Submission.zip</w:t>
-      </w:r>
-      <w:r>
-        <w:rPr>
-          <w:lang w:val="bg-BG"/>
-        </w:rPr>
-        <w:t xml:space="preserve"> (съдържа </w:t>
-      </w:r>
-      <w:proofErr w:type="spellStart"/>
-      <w:r>
-        <w:rPr>
-          <w:rFonts w:ascii="Consolas" w:eastAsia="Consolas" w:hAnsi="Consolas" w:cs="Consolas"/>
-          <w:shd w:val="clear" w:color="auto" w:fill="EFEFEF"/>
-          <w:lang w:val="bg-BG"/>
-        </w:rPr>
-        <w:t>Assets</w:t>
-      </w:r>
-      <w:proofErr w:type="spellEnd"/>
-      <w:r>
-        <w:rPr>
-          <w:rFonts w:ascii="Consolas" w:eastAsia="Consolas" w:hAnsi="Consolas" w:cs="Consolas"/>
-          <w:shd w:val="clear" w:color="auto" w:fill="EFEFEF"/>
-          <w:lang w:val="bg-BG"/>
-        </w:rPr>
-        <w:t>/</w:t>
-      </w:r>
-      <w:r>
-        <w:rPr>
-          <w:lang w:val="bg-BG"/>
-        </w:rPr>
-        <w:t xml:space="preserve">, </w:t>
-      </w:r>
-      <w:proofErr w:type="spellStart"/>
-      <w:r>
-        <w:rPr>
-          <w:rFonts w:ascii="Consolas" w:eastAsia="Consolas" w:hAnsi="Consolas" w:cs="Consolas"/>
-          <w:shd w:val="clear" w:color="auto" w:fill="EFEFEF"/>
-          <w:lang w:val="bg-BG"/>
-        </w:rPr>
-        <w:t>ProjectSettings</w:t>
-      </w:r>
-      <w:proofErr w:type="spellEnd"/>
-      <w:r>
-        <w:rPr>
-          <w:rFonts w:ascii="Consolas" w:eastAsia="Consolas" w:hAnsi="Consolas" w:cs="Consolas"/>
-          <w:shd w:val="clear" w:color="auto" w:fill="EFEFEF"/>
-          <w:lang w:val="bg-BG"/>
-        </w:rPr>
-        <w:t>/</w:t>
-      </w:r>
-      <w:r>
-        <w:rPr>
-          <w:lang w:val="bg-BG"/>
-        </w:rPr>
-        <w:t xml:space="preserve">, </w:t>
-      </w:r>
-      <w:proofErr w:type="spellStart"/>
-      <w:r>
-        <w:rPr>
-          <w:rFonts w:ascii="Consolas" w:eastAsia="Consolas" w:hAnsi="Consolas" w:cs="Consolas"/>
-          <w:shd w:val="clear" w:color="auto" w:fill="EFEFEF"/>
-          <w:lang w:val="bg-BG"/>
-        </w:rPr>
-        <w:t>Packages</w:t>
-      </w:r>
-      <w:proofErr w:type="spellEnd"/>
-      <w:r>
-        <w:rPr>
-          <w:rFonts w:ascii="Consolas" w:eastAsia="Consolas" w:hAnsi="Consolas" w:cs="Consolas"/>
-          <w:shd w:val="clear" w:color="auto" w:fill="EFEFEF"/>
-          <w:lang w:val="bg-BG"/>
-        </w:rPr>
-        <w:t>/</w:t>
-      </w:r>
-      <w:r>
-        <w:rPr>
-          <w:lang w:val="bg-BG"/>
-        </w:rPr>
-        <w:t>)</w:t>
-      </w:r>
     </w:p>
     <w:sectPr>
       <w:pgSz w:w="11906" w:h="16838"/>

</xml_diff>